<commit_message>
Add modern dashboard-style education request form
</commit_message>
<xml_diff>
--- a/맞춤형 양식.docx
+++ b/맞춤형 양식.docx
@@ -3,71 +3,90 @@
 <w:document xmlns:wpc="http://schemas.microsoft.com/office/word/2010/wordprocessingCanvas" xmlns:cx="http://schemas.microsoft.com/office/drawing/2014/chartex" xmlns:cx1="http://schemas.microsoft.com/office/drawing/2015/9/8/chartex" xmlns:cx2="http://schemas.microsoft.com/office/drawing/2015/10/21/chartex" xmlns:cx3="http://schemas.microsoft.com/office/drawing/2016/5/9/chartex" xmlns:cx4="http://schemas.microsoft.com/office/drawing/2016/5/10/chartex" xmlns:cx5="http://schemas.microsoft.com/office/drawing/2016/5/11/chartex" xmlns:cx6="http://schemas.microsoft.com/office/drawing/2016/5/12/chartex" xmlns:cx7="http://schemas.microsoft.com/office/drawing/2016/5/13/chartex" xmlns:cx8="http://schemas.microsoft.com/office/drawing/2016/5/14/chartex" xmlns:mc="http://schemas.openxmlformats.org/markup-compatibility/2006" xmlns:aink="http://schemas.microsoft.com/office/drawing/2016/ink" xmlns:am3d="http://schemas.microsoft.com/office/drawing/2017/model3d" xmlns:o="urn:schemas-microsoft-com:office:office" xmlns:oel="http://schemas.microsoft.com/office/2019/extlst" xmlns:r="http://schemas.openxmlformats.org/officeDocument/2006/relationships" xmlns:m="http://schemas.openxmlformats.org/officeDocument/2006/math" xmlns:v="urn:schemas-microsoft-com:vml" xmlns:wp14="http://schemas.microsoft.com/office/word/2010/wordprocessingDrawing" xmlns:wp="http://schemas.openxmlformats.org/drawingml/2006/wordprocessingDrawing" xmlns:w10="urn:schemas-microsoft-com:office:word" xmlns:w="http://schemas.openxmlformats.org/wordprocessingml/2006/main" xmlns:w14="http://schemas.microsoft.com/office/word/2010/wordml" xmlns:w15="http://schemas.microsoft.com/office/word/2012/wordml" xmlns:w16cex="http://schemas.microsoft.com/office/word/2018/wordml/cex" xmlns:w16cid="http://schemas.microsoft.com/office/word/2016/wordml/cid" xmlns:w16="http://schemas.microsoft.com/office/word/2018/wordml" xmlns:w16du="http://schemas.microsoft.com/office/word/2023/wordml/word16du" xmlns:w16sdtdh="http://schemas.microsoft.com/office/word/2020/wordml/sdtdatahash" xmlns:w16sdtfl="http://schemas.microsoft.com/office/word/2024/wordml/sdtformatlock" xmlns:w16se="http://schemas.microsoft.com/office/word/2015/wordml/symex" xmlns:wpg="http://schemas.microsoft.com/office/word/2010/wordprocessingGroup" xmlns:wpi="http://schemas.microsoft.com/office/word/2010/wordprocessingInk" xmlns:wne="http://schemas.microsoft.com/office/word/2006/wordml" xmlns:wps="http://schemas.microsoft.com/office/word/2010/wordprocessingShape" mc:Ignorable="w14 w15 w16se w16cid w16 w16cex w16sdtdh w16sdtfl w16du wp14">
   <w:body>
     <w:p>
+      <w:r>
+        <w:rPr>
+          <w:rFonts w:hint="eastAsia"/>
+        </w:rPr>
+        <w:t>안녕하세요 한국생산성본부 김재욱입니다.</w:t>
+      </w:r>
+    </w:p>
+    <w:p>
+      <w:r>
+        <w:rPr>
+          <w:rFonts w:hint="eastAsia"/>
+        </w:rPr>
+        <w:t>교육문의를 받아보고 메일 드립니다!</w:t>
+      </w:r>
+    </w:p>
+    <w:p/>
+    <w:p>
+      <w:r>
+        <w:rPr>
+          <w:rFonts w:hint="eastAsia"/>
+        </w:rPr>
+        <w:t xml:space="preserve">우선, 하기 건들을 작성해주시면 해당 내용을 보고 </w:t>
+      </w:r>
+      <w:proofErr w:type="spellStart"/>
+      <w:r>
+        <w:rPr>
+          <w:rFonts w:hint="eastAsia"/>
+        </w:rPr>
+        <w:t>연락드리겠습니다</w:t>
+      </w:r>
+      <w:proofErr w:type="spellEnd"/>
+      <w:r>
+        <w:rPr>
+          <w:rFonts w:hint="eastAsia"/>
+        </w:rPr>
+        <w:t>!</w:t>
+      </w:r>
+    </w:p>
+    <w:p>
+      <w:r>
+        <w:rPr>
+          <w:rFonts w:hint="eastAsia"/>
+        </w:rPr>
+        <w:t>​</w:t>
+      </w:r>
+    </w:p>
+    <w:p>
+      <w:proofErr w:type="gramStart"/>
+      <w:r>
+        <w:rPr>
+          <w:rFonts w:hint="eastAsia"/>
+        </w:rPr>
+        <w:t>요청 하신</w:t>
+      </w:r>
+      <w:proofErr w:type="gramEnd"/>
+      <w:r>
+        <w:rPr>
+          <w:rFonts w:hint="eastAsia"/>
+        </w:rPr>
+        <w:t xml:space="preserve"> 설문 </w:t>
+      </w:r>
+      <w:proofErr w:type="spellStart"/>
+      <w:r>
+        <w:rPr>
+          <w:rFonts w:hint="eastAsia"/>
+        </w:rPr>
+        <w:t>송부드리오니</w:t>
+      </w:r>
+      <w:proofErr w:type="spellEnd"/>
+      <w:r>
+        <w:rPr>
+          <w:rFonts w:hint="eastAsia"/>
+        </w:rPr>
+        <w:t xml:space="preserve"> 확인하시고 회신 부탁드리겠습니다.</w:t>
+      </w:r>
+    </w:p>
+    <w:p>
       <w:pPr>
         <w:rPr>
           <w:rFonts w:hint="eastAsia"/>
         </w:rPr>
       </w:pPr>
-      <w:r>
-        <w:rPr>
-          <w:rFonts w:hint="eastAsia"/>
-        </w:rPr>
-        <w:t>안녕하세요 한국생산성본부 김재욱입니다.</w:t>
-      </w:r>
-    </w:p>
-    <w:p>
-      <w:pPr>
-        <w:rPr>
-          <w:rFonts w:hint="eastAsia"/>
-        </w:rPr>
-      </w:pPr>
-      <w:r>
-        <w:rPr>
-          <w:rFonts w:hint="eastAsia"/>
-        </w:rPr>
-        <w:t>교육문의를 받아보고 메일 드립니다!</w:t>
-      </w:r>
-    </w:p>
-    <w:p>
-      <w:pPr>
-        <w:rPr>
-          <w:rFonts w:hint="eastAsia"/>
-        </w:rPr>
-      </w:pPr>
-    </w:p>
-    <w:p>
-      <w:pPr>
-        <w:rPr>
-          <w:rFonts w:hint="eastAsia"/>
-        </w:rPr>
-      </w:pPr>
-      <w:r>
-        <w:rPr>
-          <w:rFonts w:hint="eastAsia"/>
-        </w:rPr>
-        <w:t xml:space="preserve">우선, 하기 건들을 작성해주시면 해당 내용을 보고 </w:t>
-      </w:r>
-      <w:proofErr w:type="spellStart"/>
-      <w:r>
-        <w:rPr>
-          <w:rFonts w:hint="eastAsia"/>
-        </w:rPr>
-        <w:t>연락드리겠습니다</w:t>
-      </w:r>
-      <w:proofErr w:type="spellEnd"/>
-      <w:r>
-        <w:rPr>
-          <w:rFonts w:hint="eastAsia"/>
-        </w:rPr>
-        <w:t>!</w:t>
-      </w:r>
-    </w:p>
-    <w:p>
-      <w:pPr>
-        <w:rPr>
-          <w:rFonts w:hint="eastAsia"/>
-        </w:rPr>
-      </w:pPr>
+    </w:p>
+    <w:p>
       <w:r>
         <w:rPr>
           <w:rFonts w:hint="eastAsia"/>
@@ -76,66 +95,6 @@
       </w:r>
     </w:p>
     <w:p>
-      <w:pPr>
-        <w:rPr>
-          <w:rFonts w:hint="eastAsia"/>
-        </w:rPr>
-      </w:pPr>
-      <w:proofErr w:type="gramStart"/>
-      <w:r>
-        <w:rPr>
-          <w:rFonts w:hint="eastAsia"/>
-        </w:rPr>
-        <w:t>요청 하신</w:t>
-      </w:r>
-      <w:proofErr w:type="gramEnd"/>
-      <w:r>
-        <w:rPr>
-          <w:rFonts w:hint="eastAsia"/>
-        </w:rPr>
-        <w:t xml:space="preserve"> 설문 </w:t>
-      </w:r>
-      <w:proofErr w:type="spellStart"/>
-      <w:r>
-        <w:rPr>
-          <w:rFonts w:hint="eastAsia"/>
-        </w:rPr>
-        <w:t>송부드리오니</w:t>
-      </w:r>
-      <w:proofErr w:type="spellEnd"/>
-      <w:r>
-        <w:rPr>
-          <w:rFonts w:hint="eastAsia"/>
-        </w:rPr>
-        <w:t xml:space="preserve"> 확인하시고 회신 부탁드리겠습니다.</w:t>
-      </w:r>
-    </w:p>
-    <w:p>
-      <w:pPr>
-        <w:rPr>
-          <w:rFonts w:hint="eastAsia"/>
-        </w:rPr>
-      </w:pPr>
-    </w:p>
-    <w:p>
-      <w:pPr>
-        <w:rPr>
-          <w:rFonts w:hint="eastAsia"/>
-        </w:rPr>
-      </w:pPr>
-      <w:r>
-        <w:rPr>
-          <w:rFonts w:hint="eastAsia"/>
-        </w:rPr>
-        <w:t>​</w:t>
-      </w:r>
-    </w:p>
-    <w:p>
-      <w:pPr>
-        <w:rPr>
-          <w:rFonts w:hint="eastAsia"/>
-        </w:rPr>
-      </w:pPr>
       <w:r>
         <w:rPr>
           <w:rFonts w:hint="eastAsia"/>
@@ -167,7 +126,71 @@
         </w:trPr>
         <w:tc>
           <w:tcPr>
-            <w:tcW w:w="1605" w:type="dxa"/>
+            <w:tcW w:w="1702" w:type="dxa"/>
+            <w:tcBorders>
+              <w:top w:val="single" w:sz="6" w:space="0" w:color="000000"/>
+              <w:left w:val="single" w:sz="6" w:space="0" w:color="000000"/>
+              <w:bottom w:val="single" w:sz="6" w:space="0" w:color="000000"/>
+              <w:right w:val="single" w:sz="6" w:space="0" w:color="000000"/>
+            </w:tcBorders>
+            <w:shd w:val="clear" w:color="auto" w:fill="E5E5E5"/>
+            <w:tcMar>
+              <w:top w:w="30" w:type="dxa"/>
+              <w:left w:w="120" w:type="dxa"/>
+              <w:bottom w:w="30" w:type="dxa"/>
+              <w:right w:w="120" w:type="dxa"/>
+            </w:tcMar>
+            <w:vAlign w:val="center"/>
+          </w:tcPr>
+          <w:p>
+            <w:pPr>
+              <w:rPr>
+                <w:rFonts w:hint="eastAsia"/>
+              </w:rPr>
+            </w:pPr>
+            <w:r>
+              <w:rPr>
+                <w:rFonts w:hint="eastAsia"/>
+              </w:rPr>
+              <w:t>회사명</w:t>
+            </w:r>
+          </w:p>
+        </w:tc>
+        <w:tc>
+          <w:tcPr>
+            <w:tcW w:w="7583" w:type="dxa"/>
+            <w:gridSpan w:val="3"/>
+            <w:tcBorders>
+              <w:top w:val="single" w:sz="6" w:space="0" w:color="000000"/>
+              <w:left w:val="single" w:sz="6" w:space="0" w:color="000000"/>
+              <w:bottom w:val="single" w:sz="6" w:space="0" w:color="000000"/>
+              <w:right w:val="single" w:sz="6" w:space="0" w:color="000000"/>
+            </w:tcBorders>
+            <w:shd w:val="clear" w:color="auto" w:fill="FFFFFF"/>
+            <w:tcMar>
+              <w:top w:w="30" w:type="dxa"/>
+              <w:left w:w="120" w:type="dxa"/>
+              <w:bottom w:w="30" w:type="dxa"/>
+              <w:right w:w="120" w:type="dxa"/>
+            </w:tcMar>
+            <w:vAlign w:val="center"/>
+          </w:tcPr>
+          <w:p>
+            <w:pPr>
+              <w:rPr>
+                <w:rFonts w:hint="eastAsia"/>
+              </w:rPr>
+            </w:pPr>
+          </w:p>
+        </w:tc>
+      </w:tr>
+      <w:tr>
+        <w:trPr>
+          <w:trHeight w:val="360"/>
+        </w:trPr>
+        <w:tc>
+          <w:tcPr>
+            <w:tcW w:w="1702" w:type="dxa"/>
             <w:tcBorders>
               <w:top w:val="single" w:sz="6" w:space="0" w:color="000000"/>
               <w:left w:val="single" w:sz="6" w:space="0" w:color="000000"/>
@@ -185,11 +208,6 @@
             <w:hideMark/>
           </w:tcPr>
           <w:p>
-            <w:pPr>
-              <w:rPr>
-                <w:rFonts w:hint="eastAsia"/>
-              </w:rPr>
-            </w:pPr>
             <w:r>
               <w:rPr>
                 <w:rFonts w:hint="eastAsia"/>
@@ -200,7 +218,7 @@
         </w:tc>
         <w:tc>
           <w:tcPr>
-            <w:tcW w:w="2520" w:type="dxa"/>
+            <w:tcW w:w="2671" w:type="dxa"/>
             <w:tcBorders>
               <w:top w:val="single" w:sz="6" w:space="0" w:color="000000"/>
               <w:left w:val="single" w:sz="6" w:space="0" w:color="000000"/>
@@ -218,11 +236,6 @@
             <w:hideMark/>
           </w:tcPr>
           <w:p>
-            <w:pPr>
-              <w:rPr>
-                <w:rFonts w:hint="eastAsia"/>
-              </w:rPr>
-            </w:pPr>
             <w:r>
               <w:rPr>
                 <w:rFonts w:hint="eastAsia"/>
@@ -233,7 +246,7 @@
         </w:tc>
         <w:tc>
           <w:tcPr>
-            <w:tcW w:w="1725" w:type="dxa"/>
+            <w:tcW w:w="1828" w:type="dxa"/>
             <w:tcBorders>
               <w:top w:val="single" w:sz="6" w:space="0" w:color="000000"/>
               <w:left w:val="single" w:sz="6" w:space="0" w:color="000000"/>
@@ -251,11 +264,6 @@
             <w:hideMark/>
           </w:tcPr>
           <w:p>
-            <w:pPr>
-              <w:rPr>
-                <w:rFonts w:hint="eastAsia"/>
-              </w:rPr>
-            </w:pPr>
             <w:r>
               <w:rPr>
                 <w:rFonts w:hint="eastAsia"/>
@@ -266,7 +274,7 @@
         </w:tc>
         <w:tc>
           <w:tcPr>
-            <w:tcW w:w="2400" w:type="dxa"/>
+            <w:tcW w:w="3084" w:type="dxa"/>
             <w:tcBorders>
               <w:top w:val="single" w:sz="6" w:space="0" w:color="000000"/>
               <w:left w:val="single" w:sz="6" w:space="0" w:color="000000"/>
@@ -284,11 +292,6 @@
             <w:hideMark/>
           </w:tcPr>
           <w:p>
-            <w:pPr>
-              <w:rPr>
-                <w:rFonts w:hint="eastAsia"/>
-              </w:rPr>
-            </w:pPr>
             <w:r>
               <w:rPr>
                 <w:rFonts w:hint="eastAsia"/>
@@ -304,7 +307,7 @@
         </w:trPr>
         <w:tc>
           <w:tcPr>
-            <w:tcW w:w="1605" w:type="dxa"/>
+            <w:tcW w:w="1702" w:type="dxa"/>
             <w:tcBorders>
               <w:top w:val="single" w:sz="6" w:space="0" w:color="000000"/>
               <w:left w:val="single" w:sz="6" w:space="0" w:color="000000"/>
@@ -322,11 +325,6 @@
             <w:hideMark/>
           </w:tcPr>
           <w:p>
-            <w:pPr>
-              <w:rPr>
-                <w:rFonts w:hint="eastAsia"/>
-              </w:rPr>
-            </w:pPr>
             <w:r>
               <w:rPr>
                 <w:rFonts w:hint="eastAsia"/>
@@ -337,7 +335,7 @@
         </w:tc>
         <w:tc>
           <w:tcPr>
-            <w:tcW w:w="2520" w:type="dxa"/>
+            <w:tcW w:w="2671" w:type="dxa"/>
             <w:tcBorders>
               <w:top w:val="single" w:sz="6" w:space="0" w:color="000000"/>
               <w:left w:val="single" w:sz="6" w:space="0" w:color="000000"/>
@@ -355,11 +353,6 @@
             <w:hideMark/>
           </w:tcPr>
           <w:p>
-            <w:pPr>
-              <w:rPr>
-                <w:rFonts w:hint="eastAsia"/>
-              </w:rPr>
-            </w:pPr>
             <w:r>
               <w:rPr>
                 <w:rFonts w:hint="eastAsia"/>
@@ -370,7 +363,7 @@
         </w:tc>
         <w:tc>
           <w:tcPr>
-            <w:tcW w:w="1725" w:type="dxa"/>
+            <w:tcW w:w="1828" w:type="dxa"/>
             <w:tcBorders>
               <w:top w:val="single" w:sz="6" w:space="0" w:color="000000"/>
               <w:left w:val="single" w:sz="6" w:space="0" w:color="000000"/>
@@ -388,11 +381,6 @@
             <w:hideMark/>
           </w:tcPr>
           <w:p>
-            <w:pPr>
-              <w:rPr>
-                <w:rFonts w:hint="eastAsia"/>
-              </w:rPr>
-            </w:pPr>
             <w:r>
               <w:rPr>
                 <w:rFonts w:hint="eastAsia"/>
@@ -403,7 +391,7 @@
         </w:tc>
         <w:tc>
           <w:tcPr>
-            <w:tcW w:w="2400" w:type="dxa"/>
+            <w:tcW w:w="3084" w:type="dxa"/>
             <w:tcBorders>
               <w:top w:val="single" w:sz="6" w:space="0" w:color="000000"/>
               <w:left w:val="single" w:sz="6" w:space="0" w:color="000000"/>
@@ -421,11 +409,6 @@
             <w:hideMark/>
           </w:tcPr>
           <w:p>
-            <w:pPr>
-              <w:rPr>
-                <w:rFonts w:hint="eastAsia"/>
-              </w:rPr>
-            </w:pPr>
             <w:r>
               <w:rPr>
                 <w:rFonts w:hint="eastAsia"/>
@@ -441,7 +424,7 @@
         </w:trPr>
         <w:tc>
           <w:tcPr>
-            <w:tcW w:w="1605" w:type="dxa"/>
+            <w:tcW w:w="1702" w:type="dxa"/>
             <w:tcBorders>
               <w:top w:val="single" w:sz="6" w:space="0" w:color="000000"/>
               <w:left w:val="single" w:sz="6" w:space="0" w:color="000000"/>
@@ -459,11 +442,6 @@
             <w:hideMark/>
           </w:tcPr>
           <w:p>
-            <w:pPr>
-              <w:rPr>
-                <w:rFonts w:hint="eastAsia"/>
-              </w:rPr>
-            </w:pPr>
             <w:r>
               <w:rPr>
                 <w:rFonts w:hint="eastAsia"/>
@@ -474,7 +452,7 @@
         </w:tc>
         <w:tc>
           <w:tcPr>
-            <w:tcW w:w="7155" w:type="dxa"/>
+            <w:tcW w:w="7583" w:type="dxa"/>
             <w:gridSpan w:val="3"/>
             <w:tcBorders>
               <w:top w:val="single" w:sz="6" w:space="0" w:color="000000"/>
@@ -493,11 +471,6 @@
             <w:hideMark/>
           </w:tcPr>
           <w:p>
-            <w:pPr>
-              <w:rPr>
-                <w:rFonts w:hint="eastAsia"/>
-              </w:rPr>
-            </w:pPr>
             <w:r>
               <w:rPr>
                 <w:rFonts w:hint="eastAsia"/>
@@ -509,11 +482,6 @@
       </w:tr>
     </w:tbl>
     <w:p>
-      <w:pPr>
-        <w:rPr>
-          <w:rFonts w:hint="eastAsia"/>
-        </w:rPr>
-      </w:pPr>
       <w:r>
         <w:rPr>
           <w:rFonts w:hint="eastAsia"/>
@@ -522,11 +490,6 @@
       </w:r>
     </w:p>
     <w:p>
-      <w:pPr>
-        <w:rPr>
-          <w:rFonts w:hint="eastAsia"/>
-        </w:rPr>
-      </w:pPr>
       <w:r>
         <w:rPr>
           <w:rFonts w:hint="eastAsia"/>
@@ -557,11 +520,6 @@
       </w:r>
     </w:p>
     <w:p>
-      <w:pPr>
-        <w:rPr>
-          <w:rFonts w:hint="eastAsia"/>
-        </w:rPr>
-      </w:pPr>
       <w:r>
         <w:rPr>
           <w:rFonts w:hint="eastAsia"/>
@@ -606,11 +564,6 @@
             <w:hideMark/>
           </w:tcPr>
           <w:p>
-            <w:pPr>
-              <w:rPr>
-                <w:rFonts w:hint="eastAsia"/>
-              </w:rPr>
-            </w:pPr>
             <w:r>
               <w:rPr>
                 <w:rFonts w:hint="eastAsia"/>
@@ -622,11 +575,6 @@
       </w:tr>
     </w:tbl>
     <w:p>
-      <w:pPr>
-        <w:rPr>
-          <w:rFonts w:hint="eastAsia"/>
-        </w:rPr>
-      </w:pPr>
       <w:r>
         <w:rPr>
           <w:rFonts w:hint="eastAsia"/>
@@ -635,11 +583,6 @@
       </w:r>
     </w:p>
     <w:p>
-      <w:pPr>
-        <w:rPr>
-          <w:rFonts w:hint="eastAsia"/>
-        </w:rPr>
-      </w:pPr>
       <w:r>
         <w:rPr>
           <w:rFonts w:hint="eastAsia"/>
@@ -650,11 +593,6 @@
       </w:r>
     </w:p>
     <w:p>
-      <w:pPr>
-        <w:rPr>
-          <w:rFonts w:hint="eastAsia"/>
-        </w:rPr>
-      </w:pPr>
       <w:r>
         <w:rPr>
           <w:rFonts w:hint="eastAsia"/>
@@ -663,11 +601,6 @@
       </w:r>
     </w:p>
     <w:p>
-      <w:pPr>
-        <w:rPr>
-          <w:rFonts w:hint="eastAsia"/>
-        </w:rPr>
-      </w:pPr>
       <w:r>
         <w:rPr>
           <w:rFonts w:hint="eastAsia"/>
@@ -676,11 +609,6 @@
       </w:r>
     </w:p>
     <w:p>
-      <w:pPr>
-        <w:rPr>
-          <w:rFonts w:hint="eastAsia"/>
-        </w:rPr>
-      </w:pPr>
       <w:r>
         <w:rPr>
           <w:rFonts w:hint="eastAsia"/>
@@ -730,11 +658,6 @@
             <w:hideMark/>
           </w:tcPr>
           <w:p>
-            <w:pPr>
-              <w:rPr>
-                <w:rFonts w:hint="eastAsia"/>
-              </w:rPr>
-            </w:pPr>
             <w:r>
               <w:rPr>
                 <w:rFonts w:hint="eastAsia"/>
@@ -763,11 +686,6 @@
             <w:hideMark/>
           </w:tcPr>
           <w:p>
-            <w:pPr>
-              <w:rPr>
-                <w:rFonts w:hint="eastAsia"/>
-              </w:rPr>
-            </w:pPr>
             <w:r>
               <w:rPr>
                 <w:rFonts w:hint="eastAsia"/>
@@ -796,11 +714,6 @@
             <w:hideMark/>
           </w:tcPr>
           <w:p>
-            <w:pPr>
-              <w:rPr>
-                <w:rFonts w:hint="eastAsia"/>
-              </w:rPr>
-            </w:pPr>
             <w:r>
               <w:rPr>
                 <w:rFonts w:hint="eastAsia"/>
@@ -809,15 +722,11 @@
             </w:r>
           </w:p>
           <w:p>
-            <w:pPr>
-              <w:rPr>
-                <w:rFonts w:hint="eastAsia"/>
-              </w:rPr>
-            </w:pPr>
             <w:r>
               <w:rPr>
                 <w:rFonts w:hint="eastAsia"/>
               </w:rPr>
+              <w:lastRenderedPageBreak/>
               <w:t>및 시간</w:t>
             </w:r>
           </w:p>
@@ -842,16 +751,12 @@
             <w:hideMark/>
           </w:tcPr>
           <w:p>
-            <w:pPr>
-              <w:rPr>
-                <w:rFonts w:hint="eastAsia"/>
-              </w:rPr>
-            </w:pPr>
             <w:proofErr w:type="gramStart"/>
             <w:r>
               <w:rPr>
                 <w:rFonts w:hint="eastAsia"/>
               </w:rPr>
+              <w:lastRenderedPageBreak/>
               <w:t>일/ 시간</w:t>
             </w:r>
             <w:proofErr w:type="gramEnd"/>
@@ -883,16 +788,10 @@
             <w:hideMark/>
           </w:tcPr>
           <w:p>
-            <w:pPr>
-              <w:rPr>
-                <w:rFonts w:hint="eastAsia"/>
-              </w:rPr>
-            </w:pPr>
             <w:r>
               <w:rPr>
                 <w:rFonts w:hint="eastAsia"/>
               </w:rPr>
-              <w:lastRenderedPageBreak/>
               <w:t>강의 장소</w:t>
             </w:r>
           </w:p>
@@ -917,11 +816,6 @@
             <w:hideMark/>
           </w:tcPr>
           <w:p>
-            <w:pPr>
-              <w:rPr>
-                <w:rFonts w:hint="eastAsia"/>
-              </w:rPr>
-            </w:pPr>
             <w:r>
               <w:rPr>
                 <w:rFonts w:hint="eastAsia"/>
@@ -951,11 +845,6 @@
             <w:hideMark/>
           </w:tcPr>
           <w:p>
-            <w:pPr>
-              <w:rPr>
-                <w:rFonts w:hint="eastAsia"/>
-              </w:rPr>
-            </w:pPr>
             <w:r>
               <w:rPr>
                 <w:rFonts w:hint="eastAsia"/>
@@ -1005,11 +894,6 @@
             <w:hideMark/>
           </w:tcPr>
           <w:p>
-            <w:pPr>
-              <w:rPr>
-                <w:rFonts w:hint="eastAsia"/>
-              </w:rPr>
-            </w:pPr>
             <w:proofErr w:type="spellStart"/>
             <w:r>
               <w:rPr>
@@ -1041,11 +925,6 @@
             <w:hideMark/>
           </w:tcPr>
           <w:p>
-            <w:pPr>
-              <w:rPr>
-                <w:rFonts w:hint="eastAsia"/>
-              </w:rPr>
-            </w:pPr>
             <w:r>
               <w:rPr>
                 <w:rFonts w:hint="eastAsia"/>
@@ -1057,11 +936,6 @@
       </w:tr>
     </w:tbl>
     <w:p>
-      <w:pPr>
-        <w:rPr>
-          <w:rFonts w:hint="eastAsia"/>
-        </w:rPr>
-      </w:pPr>
       <w:r>
         <w:rPr>
           <w:rFonts w:hint="eastAsia"/>
@@ -1070,11 +944,6 @@
       </w:r>
     </w:p>
     <w:p>
-      <w:pPr>
-        <w:rPr>
-          <w:rFonts w:hint="eastAsia"/>
-        </w:rPr>
-      </w:pPr>
       <w:r>
         <w:rPr>
           <w:rFonts w:hint="eastAsia"/>
@@ -1085,35 +954,24 @@
       </w:r>
     </w:p>
     <w:p>
+      <w:r>
+        <w:rPr>
+          <w:rFonts w:hint="eastAsia"/>
+        </w:rPr>
+        <w:t>- 유사 교육 경험 이력</w:t>
+      </w:r>
+    </w:p>
+    <w:p>
+      <w:r>
+        <w:rPr>
+          <w:rFonts w:hint="eastAsia"/>
+        </w:rPr>
+        <w:t> </w:t>
+      </w:r>
+    </w:p>
+    <w:p>
       <w:pPr>
         <w:rPr>
-          <w:rFonts w:hint="eastAsia"/>
-        </w:rPr>
-      </w:pPr>
-      <w:r>
-        <w:rPr>
-          <w:rFonts w:hint="eastAsia"/>
-        </w:rPr>
-        <w:t>- 유사 교육 경험 이력</w:t>
-      </w:r>
-    </w:p>
-    <w:p>
-      <w:pPr>
-        <w:rPr>
-          <w:rFonts w:hint="eastAsia"/>
-        </w:rPr>
-      </w:pPr>
-      <w:r>
-        <w:rPr>
-          <w:rFonts w:hint="eastAsia"/>
-        </w:rPr>
-        <w:t> </w:t>
-      </w:r>
-    </w:p>
-    <w:p>
-      <w:pPr>
-        <w:rPr>
-          <w:rFonts w:hint="eastAsia"/>
           <w:b/>
           <w:bCs/>
         </w:rPr>
@@ -1128,11 +986,6 @@
       </w:r>
     </w:p>
     <w:p>
-      <w:pPr>
-        <w:rPr>
-          <w:rFonts w:hint="eastAsia"/>
-        </w:rPr>
-      </w:pPr>
       <w:r>
         <w:rPr>
           <w:rFonts w:hint="eastAsia"/>
@@ -1143,11 +996,6 @@
       </w:r>
     </w:p>
     <w:p>
-      <w:pPr>
-        <w:rPr>
-          <w:rFonts w:hint="eastAsia"/>
-        </w:rPr>
-      </w:pPr>
       <w:r>
         <w:rPr>
           <w:rFonts w:hint="eastAsia"/>
@@ -1164,11 +1012,6 @@
       <w:proofErr w:type="gramEnd"/>
     </w:p>
     <w:p>
-      <w:pPr>
-        <w:rPr>
-          <w:rFonts w:hint="eastAsia"/>
-        </w:rPr>
-      </w:pPr>
       <w:r>
         <w:rPr>
           <w:rFonts w:hint="eastAsia"/>
@@ -1185,11 +1028,6 @@
       <w:proofErr w:type="gramEnd"/>
     </w:p>
     <w:p>
-      <w:pPr>
-        <w:rPr>
-          <w:rFonts w:hint="eastAsia"/>
-        </w:rPr>
-      </w:pPr>
       <w:r>
         <w:rPr>
           <w:rFonts w:hint="eastAsia"/>
@@ -1197,19 +1035,8 @@
         <w:br/>
       </w:r>
     </w:p>
-    <w:p>
-      <w:pPr>
-        <w:rPr>
-          <w:rFonts w:hint="eastAsia"/>
-        </w:rPr>
-      </w:pPr>
-    </w:p>
-    <w:p>
-      <w:pPr>
-        <w:rPr>
-          <w:rFonts w:hint="eastAsia"/>
-        </w:rPr>
-      </w:pPr>
+    <w:p/>
+    <w:p>
       <w:r>
         <w:rPr>
           <w:rFonts w:hint="eastAsia"/>
@@ -1220,11 +1047,6 @@
       </w:r>
     </w:p>
     <w:p>
-      <w:pPr>
-        <w:rPr>
-          <w:rFonts w:hint="eastAsia"/>
-        </w:rPr>
-      </w:pPr>
       <w:r>
         <w:rPr>
           <w:rFonts w:hint="eastAsia"/>
@@ -1233,11 +1055,6 @@
       </w:r>
     </w:p>
     <w:p>
-      <w:pPr>
-        <w:rPr>
-          <w:rFonts w:hint="eastAsia"/>
-        </w:rPr>
-      </w:pPr>
       <w:r>
         <w:rPr>
           <w:rFonts w:hint="eastAsia"/>
@@ -1246,11 +1063,6 @@
       </w:r>
     </w:p>
     <w:p>
-      <w:pPr>
-        <w:rPr>
-          <w:rFonts w:hint="eastAsia"/>
-        </w:rPr>
-      </w:pPr>
       <w:r>
         <w:rPr>
           <w:rFonts w:hint="eastAsia"/>
@@ -1259,11 +1071,6 @@
       </w:r>
     </w:p>
     <w:p>
-      <w:pPr>
-        <w:rPr>
-          <w:rFonts w:hint="eastAsia"/>
-        </w:rPr>
-      </w:pPr>
       <w:r>
         <w:rPr>
           <w:rFonts w:hint="eastAsia"/>
@@ -1272,11 +1079,6 @@
       </w:r>
     </w:p>
     <w:p>
-      <w:pPr>
-        <w:rPr>
-          <w:rFonts w:hint="eastAsia"/>
-        </w:rPr>
-      </w:pPr>
       <w:r>
         <w:rPr>
           <w:rFonts w:hint="eastAsia"/>
@@ -1285,11 +1087,6 @@
       </w:r>
     </w:p>
     <w:p>
-      <w:pPr>
-        <w:rPr>
-          <w:rFonts w:hint="eastAsia"/>
-        </w:rPr>
-      </w:pPr>
       <w:r>
         <w:rPr>
           <w:rFonts w:hint="eastAsia"/>
@@ -1298,11 +1095,6 @@
       </w:r>
     </w:p>
     <w:p>
-      <w:pPr>
-        <w:rPr>
-          <w:rFonts w:hint="eastAsia"/>
-        </w:rPr>
-      </w:pPr>
       <w:r>
         <w:rPr>
           <w:rFonts w:hint="eastAsia"/>
@@ -1319,6 +1111,103 @@
     </w:sectPr>
   </w:body>
 </w:document>
+</file>
+
+<file path=word/numbering.xml><?xml version="1.0" encoding="utf-8"?>
+<w:numbering xmlns:wpc="http://schemas.microsoft.com/office/word/2010/wordprocessingCanvas" xmlns:cx="http://schemas.microsoft.com/office/drawing/2014/chartex" xmlns:cx1="http://schemas.microsoft.com/office/drawing/2015/9/8/chartex" xmlns:cx2="http://schemas.microsoft.com/office/drawing/2015/10/21/chartex" xmlns:cx3="http://schemas.microsoft.com/office/drawing/2016/5/9/chartex" xmlns:cx4="http://schemas.microsoft.com/office/drawing/2016/5/10/chartex" xmlns:cx5="http://schemas.microsoft.com/office/drawing/2016/5/11/chartex" xmlns:cx6="http://schemas.microsoft.com/office/drawing/2016/5/12/chartex" xmlns:cx7="http://schemas.microsoft.com/office/drawing/2016/5/13/chartex" xmlns:cx8="http://schemas.microsoft.com/office/drawing/2016/5/14/chartex" xmlns:mc="http://schemas.openxmlformats.org/markup-compatibility/2006" xmlns:aink="http://schemas.microsoft.com/office/drawing/2016/ink" xmlns:am3d="http://schemas.microsoft.com/office/drawing/2017/model3d" xmlns:o="urn:schemas-microsoft-com:office:office" xmlns:oel="http://schemas.microsoft.com/office/2019/extlst" xmlns:r="http://schemas.openxmlformats.org/officeDocument/2006/relationships" xmlns:m="http://schemas.openxmlformats.org/officeDocument/2006/math" xmlns:v="urn:schemas-microsoft-com:vml" xmlns:wp14="http://schemas.microsoft.com/office/word/2010/wordprocessingDrawing" xmlns:wp="http://schemas.openxmlformats.org/drawingml/2006/wordprocessingDrawing" xmlns:w10="urn:schemas-microsoft-com:office:word" xmlns:w="http://schemas.openxmlformats.org/wordprocessingml/2006/main" xmlns:w14="http://schemas.microsoft.com/office/word/2010/wordml" xmlns:w15="http://schemas.microsoft.com/office/word/2012/wordml" xmlns:w16cex="http://schemas.microsoft.com/office/word/2018/wordml/cex" xmlns:w16cid="http://schemas.microsoft.com/office/word/2016/wordml/cid" xmlns:w16="http://schemas.microsoft.com/office/word/2018/wordml" xmlns:w16du="http://schemas.microsoft.com/office/word/2023/wordml/word16du" xmlns:w16sdtdh="http://schemas.microsoft.com/office/word/2020/wordml/sdtdatahash" xmlns:w16sdtfl="http://schemas.microsoft.com/office/word/2024/wordml/sdtformatlock" xmlns:w16se="http://schemas.microsoft.com/office/word/2015/wordml/symex" xmlns:wpg="http://schemas.microsoft.com/office/word/2010/wordprocessingGroup" xmlns:wpi="http://schemas.microsoft.com/office/word/2010/wordprocessingInk" xmlns:wne="http://schemas.microsoft.com/office/word/2006/wordml" xmlns:wps="http://schemas.microsoft.com/office/word/2010/wordprocessingShape" mc:Ignorable="w14 w15 w16se w16cid w16 w16cex w16sdtdh w16sdtfl w16du wp14">
+  <w:abstractNum w:abstractNumId="0" w15:restartNumberingAfterBreak="0">
+    <w:nsid w:val="57301A7B"/>
+    <w:multiLevelType w:val="hybridMultilevel"/>
+    <w:tmpl w:val="68308DAE"/>
+    <w:lvl w:ilvl="0" w:tplc="E7007FE8">
+      <w:start w:val="1"/>
+      <w:numFmt w:val="decimal"/>
+      <w:lvlText w:val="%1."/>
+      <w:lvlJc w:val="left"/>
+      <w:pPr>
+        <w:ind w:left="800" w:hanging="360"/>
+      </w:pPr>
+      <w:rPr>
+        <w:rFonts w:hint="default"/>
+      </w:rPr>
+    </w:lvl>
+    <w:lvl w:ilvl="1" w:tplc="04090019" w:tentative="1">
+      <w:start w:val="1"/>
+      <w:numFmt w:val="upperLetter"/>
+      <w:lvlText w:val="%2."/>
+      <w:lvlJc w:val="left"/>
+      <w:pPr>
+        <w:ind w:left="1320" w:hanging="440"/>
+      </w:pPr>
+    </w:lvl>
+    <w:lvl w:ilvl="2" w:tplc="0409001B" w:tentative="1">
+      <w:start w:val="1"/>
+      <w:numFmt w:val="lowerRoman"/>
+      <w:lvlText w:val="%3."/>
+      <w:lvlJc w:val="right"/>
+      <w:pPr>
+        <w:ind w:left="1760" w:hanging="440"/>
+      </w:pPr>
+    </w:lvl>
+    <w:lvl w:ilvl="3" w:tplc="0409000F" w:tentative="1">
+      <w:start w:val="1"/>
+      <w:numFmt w:val="decimal"/>
+      <w:lvlText w:val="%4."/>
+      <w:lvlJc w:val="left"/>
+      <w:pPr>
+        <w:ind w:left="2200" w:hanging="440"/>
+      </w:pPr>
+    </w:lvl>
+    <w:lvl w:ilvl="4" w:tplc="04090019" w:tentative="1">
+      <w:start w:val="1"/>
+      <w:numFmt w:val="upperLetter"/>
+      <w:lvlText w:val="%5."/>
+      <w:lvlJc w:val="left"/>
+      <w:pPr>
+        <w:ind w:left="2640" w:hanging="440"/>
+      </w:pPr>
+    </w:lvl>
+    <w:lvl w:ilvl="5" w:tplc="0409001B" w:tentative="1">
+      <w:start w:val="1"/>
+      <w:numFmt w:val="lowerRoman"/>
+      <w:lvlText w:val="%6."/>
+      <w:lvlJc w:val="right"/>
+      <w:pPr>
+        <w:ind w:left="3080" w:hanging="440"/>
+      </w:pPr>
+    </w:lvl>
+    <w:lvl w:ilvl="6" w:tplc="0409000F" w:tentative="1">
+      <w:start w:val="1"/>
+      <w:numFmt w:val="decimal"/>
+      <w:lvlText w:val="%7."/>
+      <w:lvlJc w:val="left"/>
+      <w:pPr>
+        <w:ind w:left="3520" w:hanging="440"/>
+      </w:pPr>
+    </w:lvl>
+    <w:lvl w:ilvl="7" w:tplc="04090019" w:tentative="1">
+      <w:start w:val="1"/>
+      <w:numFmt w:val="upperLetter"/>
+      <w:lvlText w:val="%8."/>
+      <w:lvlJc w:val="left"/>
+      <w:pPr>
+        <w:ind w:left="3960" w:hanging="440"/>
+      </w:pPr>
+    </w:lvl>
+    <w:lvl w:ilvl="8" w:tplc="0409001B" w:tentative="1">
+      <w:start w:val="1"/>
+      <w:numFmt w:val="lowerRoman"/>
+      <w:lvlText w:val="%9."/>
+      <w:lvlJc w:val="right"/>
+      <w:pPr>
+        <w:ind w:left="4400" w:hanging="440"/>
+      </w:pPr>
+    </w:lvl>
+  </w:abstractNum>
+  <w:num w:numId="1" w16cid:durableId="549070839">
+    <w:abstractNumId w:val="0"/>
+  </w:num>
+</w:numbering>
 </file>
 
 <file path=word/styles.xml><?xml version="1.0" encoding="utf-8"?>
@@ -1928,6 +1817,7 @@
   <w:style w:type="character" w:default="1" w:styleId="a0">
     <w:name w:val="Default Paragraph Font"/>
     <w:uiPriority w:val="1"/>
+    <w:semiHidden/>
     <w:unhideWhenUsed/>
   </w:style>
   <w:style w:type="table" w:default="1" w:styleId="a1">

</xml_diff>